<commit_message>
Add portfolio, SEO meta, brand polish, baseline pricing note, Stripe foundation (hidden)
</commit_message>
<xml_diff>
--- a/public/SBCre8ive_LinkedIn_Requirements_Form.docx
+++ b/public/SBCre8ive_LinkedIn_Requirements_Form.docx
@@ -24,12 +24,6 @@
         <w:gridCol w:w="7550"/>
       </w:tblGrid>
       <w:tr>
-        <w:tblPrEx>
-          <w:tblCellMar>
-            <w:top w:w="0" w:type="dxa"/>
-            <w:bottom w:w="0" w:type="dxa"/>
-          </w:tblCellMar>
-        </w:tblPrEx>
         <w:tc>
           <w:tcPr>
             <w:tcW w:w="1800" w:type="dxa"/>
@@ -158,12 +152,6 @@
         </w:tc>
       </w:tr>
       <w:tr>
-        <w:tblPrEx>
-          <w:tblCellMar>
-            <w:top w:w="0" w:type="dxa"/>
-            <w:bottom w:w="0" w:type="dxa"/>
-          </w:tblCellMar>
-        </w:tblPrEx>
         <w:tc>
           <w:tcPr>
             <w:tcW w:w="9360" w:type="dxa"/>
@@ -212,12 +200,6 @@
         <w:gridCol w:w="9360"/>
       </w:tblGrid>
       <w:tr>
-        <w:tblPrEx>
-          <w:tblCellMar>
-            <w:top w:w="0" w:type="dxa"/>
-            <w:bottom w:w="0" w:type="dxa"/>
-          </w:tblCellMar>
-        </w:tblPrEx>
         <w:tc>
           <w:tcPr>
             <w:tcW w:w="9360" w:type="dxa"/>
@@ -236,18 +218,27 @@
             </w:tcMar>
           </w:tcPr>
           <w:p>
-            <w:proofErr w:type="gramStart"/>
-            <w:r>
-              <w:rPr>
+            <w:r>
+              <w:rPr>
+                <w:rFonts w:ascii="Segoe UI Emoji" w:hAnsi="Segoe UI Emoji" w:cs="Segoe UI Emoji"/>
                 <w:i/>
                 <w:iCs/>
                 <w:color w:val="374151"/>
                 <w:sz w:val="18"/>
                 <w:szCs w:val="18"/>
               </w:rPr>
-              <w:t>📌  Complete</w:t>
-            </w:r>
-            <w:proofErr w:type="gramEnd"/>
+              <w:t>📌</w:t>
+            </w:r>
+            <w:r>
+              <w:rPr>
+                <w:i/>
+                <w:iCs/>
+                <w:color w:val="374151"/>
+                <w:sz w:val="18"/>
+                <w:szCs w:val="18"/>
+              </w:rPr>
+              <w:t xml:space="preserve"> Complete</w:t>
+            </w:r>
             <w:r>
               <w:rPr>
                 <w:i/>
@@ -290,12 +281,6 @@
         <w:gridCol w:w="3122"/>
       </w:tblGrid>
       <w:tr>
-        <w:tblPrEx>
-          <w:tblCellMar>
-            <w:top w:w="0" w:type="dxa"/>
-            <w:bottom w:w="0" w:type="dxa"/>
-          </w:tblCellMar>
-        </w:tblPrEx>
         <w:tc>
           <w:tcPr>
             <w:tcW w:w="3120" w:type="dxa"/>
@@ -348,12 +333,6 @@
               <w:gridCol w:w="3000"/>
             </w:tblGrid>
             <w:tr>
-              <w:tblPrEx>
-                <w:tblCellMar>
-                  <w:top w:w="0" w:type="dxa"/>
-                  <w:bottom w:w="0" w:type="dxa"/>
-                </w:tblCellMar>
-              </w:tblPrEx>
               <w:tc>
                 <w:tcPr>
                   <w:tcW w:w="3000" w:type="dxa"/>
@@ -429,12 +408,6 @@
               <w:gridCol w:w="2880"/>
             </w:tblGrid>
             <w:tr>
-              <w:tblPrEx>
-                <w:tblCellMar>
-                  <w:top w:w="0" w:type="dxa"/>
-                  <w:bottom w:w="0" w:type="dxa"/>
-                </w:tblCellMar>
-              </w:tblPrEx>
               <w:tc>
                 <w:tcPr>
                   <w:tcW w:w="2880" w:type="dxa"/>
@@ -510,12 +483,6 @@
               <w:gridCol w:w="3000"/>
             </w:tblGrid>
             <w:tr>
-              <w:tblPrEx>
-                <w:tblCellMar>
-                  <w:top w:w="0" w:type="dxa"/>
-                  <w:bottom w:w="0" w:type="dxa"/>
-                </w:tblCellMar>
-              </w:tblPrEx>
               <w:tc>
                 <w:tcPr>
                   <w:tcW w:w="3000" w:type="dxa"/>
@@ -568,12 +535,6 @@
         <w:gridCol w:w="9160"/>
       </w:tblGrid>
       <w:tr>
-        <w:tblPrEx>
-          <w:tblCellMar>
-            <w:top w:w="0" w:type="dxa"/>
-            <w:bottom w:w="0" w:type="dxa"/>
-          </w:tblCellMar>
-        </w:tblPrEx>
         <w:tc>
           <w:tcPr>
             <w:tcW w:w="200" w:type="dxa"/>
@@ -650,12 +611,6 @@
         <w:gridCol w:w="4742"/>
       </w:tblGrid>
       <w:tr>
-        <w:tblPrEx>
-          <w:tblCellMar>
-            <w:top w:w="0" w:type="dxa"/>
-            <w:bottom w:w="0" w:type="dxa"/>
-          </w:tblCellMar>
-        </w:tblPrEx>
         <w:tc>
           <w:tcPr>
             <w:tcW w:w="4620" w:type="dxa"/>
@@ -708,12 +663,6 @@
               <w:gridCol w:w="4500"/>
             </w:tblGrid>
             <w:tr>
-              <w:tblPrEx>
-                <w:tblCellMar>
-                  <w:top w:w="0" w:type="dxa"/>
-                  <w:bottom w:w="0" w:type="dxa"/>
-                </w:tblCellMar>
-              </w:tblPrEx>
               <w:tc>
                 <w:tcPr>
                   <w:tcW w:w="4500" w:type="dxa"/>
@@ -789,12 +738,6 @@
               <w:gridCol w:w="4620"/>
             </w:tblGrid>
             <w:tr>
-              <w:tblPrEx>
-                <w:tblCellMar>
-                  <w:top w:w="0" w:type="dxa"/>
-                  <w:bottom w:w="0" w:type="dxa"/>
-                </w:tblCellMar>
-              </w:tblPrEx>
               <w:tc>
                 <w:tcPr>
                   <w:tcW w:w="4620" w:type="dxa"/>
@@ -847,12 +790,6 @@
         <w:gridCol w:w="4742"/>
       </w:tblGrid>
       <w:tr>
-        <w:tblPrEx>
-          <w:tblCellMar>
-            <w:top w:w="0" w:type="dxa"/>
-            <w:bottom w:w="0" w:type="dxa"/>
-          </w:tblCellMar>
-        </w:tblPrEx>
         <w:tc>
           <w:tcPr>
             <w:tcW w:w="4620" w:type="dxa"/>
@@ -905,12 +842,6 @@
               <w:gridCol w:w="4500"/>
             </w:tblGrid>
             <w:tr>
-              <w:tblPrEx>
-                <w:tblCellMar>
-                  <w:top w:w="0" w:type="dxa"/>
-                  <w:bottom w:w="0" w:type="dxa"/>
-                </w:tblCellMar>
-              </w:tblPrEx>
               <w:tc>
                 <w:tcPr>
                   <w:tcW w:w="4500" w:type="dxa"/>
@@ -986,12 +917,6 @@
               <w:gridCol w:w="4620"/>
             </w:tblGrid>
             <w:tr>
-              <w:tblPrEx>
-                <w:tblCellMar>
-                  <w:top w:w="0" w:type="dxa"/>
-                  <w:bottom w:w="0" w:type="dxa"/>
-                </w:tblCellMar>
-              </w:tblPrEx>
               <w:tc>
                 <w:tcPr>
                   <w:tcW w:w="4620" w:type="dxa"/>
@@ -1073,12 +998,6 @@
         <w:gridCol w:w="9360"/>
       </w:tblGrid>
       <w:tr>
-        <w:tblPrEx>
-          <w:tblCellMar>
-            <w:top w:w="0" w:type="dxa"/>
-            <w:bottom w:w="0" w:type="dxa"/>
-          </w:tblCellMar>
-        </w:tblPrEx>
         <w:tc>
           <w:tcPr>
             <w:tcW w:w="9360" w:type="dxa"/>
@@ -1141,12 +1060,6 @@
         <w:gridCol w:w="9360"/>
       </w:tblGrid>
       <w:tr>
-        <w:tblPrEx>
-          <w:tblCellMar>
-            <w:top w:w="0" w:type="dxa"/>
-            <w:bottom w:w="0" w:type="dxa"/>
-          </w:tblCellMar>
-        </w:tblPrEx>
         <w:tc>
           <w:tcPr>
             <w:tcW w:w="9360" w:type="dxa"/>
@@ -1195,12 +1108,6 @@
         <w:gridCol w:w="4742"/>
       </w:tblGrid>
       <w:tr>
-        <w:tblPrEx>
-          <w:tblCellMar>
-            <w:top w:w="0" w:type="dxa"/>
-            <w:bottom w:w="0" w:type="dxa"/>
-          </w:tblCellMar>
-        </w:tblPrEx>
         <w:tc>
           <w:tcPr>
             <w:tcW w:w="4620" w:type="dxa"/>
@@ -1253,12 +1160,6 @@
               <w:gridCol w:w="4500"/>
             </w:tblGrid>
             <w:tr>
-              <w:tblPrEx>
-                <w:tblCellMar>
-                  <w:top w:w="0" w:type="dxa"/>
-                  <w:bottom w:w="0" w:type="dxa"/>
-                </w:tblCellMar>
-              </w:tblPrEx>
               <w:tc>
                 <w:tcPr>
                   <w:tcW w:w="4500" w:type="dxa"/>
@@ -1334,12 +1235,6 @@
               <w:gridCol w:w="4620"/>
             </w:tblGrid>
             <w:tr>
-              <w:tblPrEx>
-                <w:tblCellMar>
-                  <w:top w:w="0" w:type="dxa"/>
-                  <w:bottom w:w="0" w:type="dxa"/>
-                </w:tblCellMar>
-              </w:tblPrEx>
               <w:tc>
                 <w:tcPr>
                   <w:tcW w:w="4620" w:type="dxa"/>
@@ -1414,12 +1309,6 @@
         <w:gridCol w:w="2340"/>
       </w:tblGrid>
       <w:tr>
-        <w:tblPrEx>
-          <w:tblCellMar>
-            <w:top w:w="0" w:type="dxa"/>
-            <w:bottom w:w="0" w:type="dxa"/>
-          </w:tblCellMar>
-        </w:tblPrEx>
         <w:tc>
           <w:tcPr>
             <w:tcW w:w="2340" w:type="dxa"/>
@@ -1489,15 +1378,7 @@
                 <w:sz w:val="20"/>
                 <w:szCs w:val="20"/>
               </w:rPr>
-              <w:t xml:space="preserve"> Finance</w:t>
-            </w:r>
-            <w:r>
-              <w:rPr>
-                <w:color w:val="1B1B1B"/>
-                <w:sz w:val="20"/>
-                <w:szCs w:val="20"/>
-              </w:rPr>
-              <w:t xml:space="preserve"> / Banking</w:t>
+              <w:t xml:space="preserve"> Finance / Banking</w:t>
             </w:r>
           </w:p>
         </w:tc>
@@ -1569,15 +1450,7 @@
                 <w:sz w:val="20"/>
                 <w:szCs w:val="20"/>
               </w:rPr>
-              <w:t xml:space="preserve"> Marketing</w:t>
-            </w:r>
-            <w:r>
-              <w:rPr>
-                <w:color w:val="1B1B1B"/>
-                <w:sz w:val="20"/>
-                <w:szCs w:val="20"/>
-              </w:rPr>
-              <w:t xml:space="preserve"> / Advertising</w:t>
+              <w:t xml:space="preserve"> Marketing / Advertising</w:t>
             </w:r>
           </w:p>
         </w:tc>
@@ -1612,12 +1485,6 @@
         <w:gridCol w:w="2340"/>
       </w:tblGrid>
       <w:tr>
-        <w:tblPrEx>
-          <w:tblCellMar>
-            <w:top w:w="0" w:type="dxa"/>
-            <w:bottom w:w="0" w:type="dxa"/>
-          </w:tblCellMar>
-        </w:tblPrEx>
         <w:tc>
           <w:tcPr>
             <w:tcW w:w="2340" w:type="dxa"/>
@@ -1650,15 +1517,7 @@
                 <w:sz w:val="20"/>
                 <w:szCs w:val="20"/>
               </w:rPr>
-              <w:t xml:space="preserve"> Real</w:t>
-            </w:r>
-            <w:r>
-              <w:rPr>
-                <w:color w:val="1B1B1B"/>
-                <w:sz w:val="20"/>
-                <w:szCs w:val="20"/>
-              </w:rPr>
-              <w:t xml:space="preserve"> Estate</w:t>
+              <w:t xml:space="preserve"> Real Estate</w:t>
             </w:r>
           </w:p>
         </w:tc>
@@ -1801,12 +1660,6 @@
         <w:gridCol w:w="2340"/>
       </w:tblGrid>
       <w:tr>
-        <w:tblPrEx>
-          <w:tblCellMar>
-            <w:top w:w="0" w:type="dxa"/>
-            <w:bottom w:w="0" w:type="dxa"/>
-          </w:tblCellMar>
-        </w:tblPrEx>
         <w:tc>
           <w:tcPr>
             <w:tcW w:w="2340" w:type="dxa"/>
@@ -1839,15 +1692,7 @@
                 <w:sz w:val="20"/>
                 <w:szCs w:val="20"/>
               </w:rPr>
-              <w:t xml:space="preserve"> Nonprofit</w:t>
-            </w:r>
-            <w:r>
-              <w:rPr>
-                <w:color w:val="1B1B1B"/>
-                <w:sz w:val="20"/>
-                <w:szCs w:val="20"/>
-              </w:rPr>
-              <w:t xml:space="preserve"> / NGO</w:t>
+              <w:t xml:space="preserve"> Nonprofit / NGO</w:t>
             </w:r>
           </w:p>
         </w:tc>
@@ -1955,15 +1800,7 @@
                 <w:sz w:val="20"/>
                 <w:szCs w:val="20"/>
               </w:rPr>
-              <w:t xml:space="preserve"> Other</w:t>
-            </w:r>
-            <w:r>
-              <w:rPr>
-                <w:color w:val="1B1B1B"/>
-                <w:sz w:val="20"/>
-                <w:szCs w:val="20"/>
-              </w:rPr>
-              <w:t>:</w:t>
+              <w:t xml:space="preserve"> Other:</w:t>
             </w:r>
           </w:p>
         </w:tc>
@@ -2030,12 +1867,6 @@
         <w:gridCol w:w="9360"/>
       </w:tblGrid>
       <w:tr>
-        <w:tblPrEx>
-          <w:tblCellMar>
-            <w:top w:w="0" w:type="dxa"/>
-            <w:bottom w:w="0" w:type="dxa"/>
-          </w:tblCellMar>
-        </w:tblPrEx>
         <w:tc>
           <w:tcPr>
             <w:tcW w:w="9360" w:type="dxa"/>
@@ -2084,12 +1915,6 @@
         <w:gridCol w:w="9160"/>
       </w:tblGrid>
       <w:tr>
-        <w:tblPrEx>
-          <w:tblCellMar>
-            <w:top w:w="0" w:type="dxa"/>
-            <w:bottom w:w="0" w:type="dxa"/>
-          </w:tblCellMar>
-        </w:tblPrEx>
         <w:tc>
           <w:tcPr>
             <w:tcW w:w="200" w:type="dxa"/>
@@ -2187,12 +2012,6 @@
         <w:gridCol w:w="3120"/>
       </w:tblGrid>
       <w:tr>
-        <w:tblPrEx>
-          <w:tblCellMar>
-            <w:top w:w="0" w:type="dxa"/>
-            <w:bottom w:w="0" w:type="dxa"/>
-          </w:tblCellMar>
-        </w:tblPrEx>
         <w:tc>
           <w:tcPr>
             <w:tcW w:w="3120" w:type="dxa"/>
@@ -2225,15 +2044,7 @@
                 <w:sz w:val="20"/>
                 <w:szCs w:val="20"/>
               </w:rPr>
-              <w:t xml:space="preserve"> Yes</w:t>
-            </w:r>
-            <w:r>
-              <w:rPr>
-                <w:color w:val="1B1B1B"/>
-                <w:sz w:val="20"/>
-                <w:szCs w:val="20"/>
-              </w:rPr>
-              <w:t xml:space="preserve"> — I will provide it</w:t>
+              <w:t xml:space="preserve"> Yes — I will provide it</w:t>
             </w:r>
           </w:p>
         </w:tc>
@@ -2269,15 +2080,7 @@
                 <w:sz w:val="20"/>
                 <w:szCs w:val="20"/>
               </w:rPr>
-              <w:t xml:space="preserve"> No</w:t>
-            </w:r>
-            <w:r>
-              <w:rPr>
-                <w:color w:val="1B1B1B"/>
-                <w:sz w:val="20"/>
-                <w:szCs w:val="20"/>
-              </w:rPr>
-              <w:t xml:space="preserve"> — need photographer recs</w:t>
+              <w:t xml:space="preserve"> No — need photographer recs</w:t>
             </w:r>
           </w:p>
         </w:tc>
@@ -2313,15 +2116,7 @@
                 <w:sz w:val="20"/>
                 <w:szCs w:val="20"/>
               </w:rPr>
-              <w:t xml:space="preserve"> No</w:t>
-            </w:r>
-            <w:r>
-              <w:rPr>
-                <w:color w:val="1B1B1B"/>
-                <w:sz w:val="20"/>
-                <w:szCs w:val="20"/>
-              </w:rPr>
-              <w:t xml:space="preserve"> — using casual photo for now</w:t>
+              <w:t xml:space="preserve"> No — using casual photo for now</w:t>
             </w:r>
           </w:p>
         </w:tc>
@@ -2383,12 +2178,6 @@
         <w:gridCol w:w="9360"/>
       </w:tblGrid>
       <w:tr>
-        <w:tblPrEx>
-          <w:tblCellMar>
-            <w:top w:w="0" w:type="dxa"/>
-            <w:bottom w:w="0" w:type="dxa"/>
-          </w:tblCellMar>
-        </w:tblPrEx>
         <w:tc>
           <w:tcPr>
             <w:tcW w:w="9360" w:type="dxa"/>
@@ -2480,12 +2269,6 @@
         <w:gridCol w:w="3120"/>
       </w:tblGrid>
       <w:tr>
-        <w:tblPrEx>
-          <w:tblCellMar>
-            <w:top w:w="0" w:type="dxa"/>
-            <w:bottom w:w="0" w:type="dxa"/>
-          </w:tblCellMar>
-        </w:tblPrEx>
         <w:tc>
           <w:tcPr>
             <w:tcW w:w="3120" w:type="dxa"/>
@@ -2518,15 +2301,7 @@
                 <w:sz w:val="20"/>
                 <w:szCs w:val="20"/>
               </w:rPr>
-              <w:t xml:space="preserve"> I</w:t>
-            </w:r>
-            <w:r>
-              <w:rPr>
-                <w:color w:val="1B1B1B"/>
-                <w:sz w:val="20"/>
-                <w:szCs w:val="20"/>
-              </w:rPr>
-              <w:t xml:space="preserve"> have a banner ready</w:t>
+              <w:t xml:space="preserve"> I have a banner ready</w:t>
             </w:r>
           </w:p>
         </w:tc>
@@ -2562,15 +2337,7 @@
                 <w:sz w:val="20"/>
                 <w:szCs w:val="20"/>
               </w:rPr>
-              <w:t xml:space="preserve"> Create</w:t>
-            </w:r>
-            <w:r>
-              <w:rPr>
-                <w:color w:val="1B1B1B"/>
-                <w:sz w:val="20"/>
-                <w:szCs w:val="20"/>
-              </w:rPr>
-              <w:t xml:space="preserve"> one for me</w:t>
+              <w:t xml:space="preserve"> Create one for me</w:t>
             </w:r>
           </w:p>
         </w:tc>
@@ -2606,15 +2373,7 @@
                 <w:sz w:val="20"/>
                 <w:szCs w:val="20"/>
               </w:rPr>
-              <w:t xml:space="preserve"> Use</w:t>
-            </w:r>
-            <w:r>
-              <w:rPr>
-                <w:color w:val="1B1B1B"/>
-                <w:sz w:val="20"/>
-                <w:szCs w:val="20"/>
-              </w:rPr>
-              <w:t xml:space="preserve"> generic default for now</w:t>
+              <w:t xml:space="preserve"> Use generic default for now</w:t>
             </w:r>
           </w:p>
         </w:tc>
@@ -2661,12 +2420,6 @@
         <w:gridCol w:w="9360"/>
       </w:tblGrid>
       <w:tr>
-        <w:tblPrEx>
-          <w:tblCellMar>
-            <w:top w:w="0" w:type="dxa"/>
-            <w:bottom w:w="0" w:type="dxa"/>
-          </w:tblCellMar>
-        </w:tblPrEx>
         <w:tc>
           <w:tcPr>
             <w:tcW w:w="9360" w:type="dxa"/>
@@ -2715,12 +2468,6 @@
         <w:gridCol w:w="9160"/>
       </w:tblGrid>
       <w:tr>
-        <w:tblPrEx>
-          <w:tblCellMar>
-            <w:top w:w="0" w:type="dxa"/>
-            <w:bottom w:w="0" w:type="dxa"/>
-          </w:tblCellMar>
-        </w:tblPrEx>
         <w:tc>
           <w:tcPr>
             <w:tcW w:w="200" w:type="dxa"/>
@@ -2796,12 +2543,6 @@
         <w:gridCol w:w="9360"/>
       </w:tblGrid>
       <w:tr>
-        <w:tblPrEx>
-          <w:tblCellMar>
-            <w:top w:w="0" w:type="dxa"/>
-            <w:bottom w:w="0" w:type="dxa"/>
-          </w:tblCellMar>
-        </w:tblPrEx>
         <w:tc>
           <w:tcPr>
             <w:tcW w:w="9360" w:type="dxa"/>
@@ -2839,17 +2580,7 @@
                 <w:sz w:val="18"/>
                 <w:szCs w:val="18"/>
               </w:rPr>
-              <w:t xml:space="preserve"> The</w:t>
-            </w:r>
-            <w:r>
-              <w:rPr>
-                <w:i/>
-                <w:iCs/>
-                <w:color w:val="374151"/>
-                <w:sz w:val="18"/>
-                <w:szCs w:val="18"/>
-              </w:rPr>
-              <w:t xml:space="preserve"> About section is your elevator pitch — up to 2,600 characters. Answer the questions below so we can craft a compelling narrative.</w:t>
+              <w:t xml:space="preserve"> The About section is your elevator pitch — up to 2,600 characters. Answer the questions below so we can craft a compelling narrative.</w:t>
             </w:r>
           </w:p>
         </w:tc>
@@ -2896,12 +2627,6 @@
         <w:gridCol w:w="9360"/>
       </w:tblGrid>
       <w:tr>
-        <w:tblPrEx>
-          <w:tblCellMar>
-            <w:top w:w="0" w:type="dxa"/>
-            <w:bottom w:w="0" w:type="dxa"/>
-          </w:tblCellMar>
-        </w:tblPrEx>
         <w:tc>
           <w:tcPr>
             <w:tcW w:w="9360" w:type="dxa"/>
@@ -2964,12 +2689,6 @@
         <w:gridCol w:w="9360"/>
       </w:tblGrid>
       <w:tr>
-        <w:tblPrEx>
-          <w:tblCellMar>
-            <w:top w:w="0" w:type="dxa"/>
-            <w:bottom w:w="0" w:type="dxa"/>
-          </w:tblCellMar>
-        </w:tblPrEx>
         <w:tc>
           <w:tcPr>
             <w:tcW w:w="9360" w:type="dxa"/>
@@ -3047,12 +2766,6 @@
         <w:gridCol w:w="9360"/>
       </w:tblGrid>
       <w:tr>
-        <w:tblPrEx>
-          <w:tblCellMar>
-            <w:top w:w="0" w:type="dxa"/>
-            <w:bottom w:w="0" w:type="dxa"/>
-          </w:tblCellMar>
-        </w:tblPrEx>
         <w:tc>
           <w:tcPr>
             <w:tcW w:w="9360" w:type="dxa"/>
@@ -3130,12 +2843,6 @@
         <w:gridCol w:w="9360"/>
       </w:tblGrid>
       <w:tr>
-        <w:tblPrEx>
-          <w:tblCellMar>
-            <w:top w:w="0" w:type="dxa"/>
-            <w:bottom w:w="0" w:type="dxa"/>
-          </w:tblCellMar>
-        </w:tblPrEx>
         <w:tc>
           <w:tcPr>
             <w:tcW w:w="9360" w:type="dxa"/>
@@ -3205,12 +2912,6 @@
         <w:gridCol w:w="3120"/>
       </w:tblGrid>
       <w:tr>
-        <w:tblPrEx>
-          <w:tblCellMar>
-            <w:top w:w="0" w:type="dxa"/>
-            <w:bottom w:w="0" w:type="dxa"/>
-          </w:tblCellMar>
-        </w:tblPrEx>
         <w:tc>
           <w:tcPr>
             <w:tcW w:w="3120" w:type="dxa"/>
@@ -3243,15 +2944,7 @@
                 <w:sz w:val="20"/>
                 <w:szCs w:val="20"/>
               </w:rPr>
-              <w:t xml:space="preserve"> Authoritative</w:t>
-            </w:r>
-            <w:r>
-              <w:rPr>
-                <w:color w:val="1B1B1B"/>
-                <w:sz w:val="20"/>
-                <w:szCs w:val="20"/>
-              </w:rPr>
-              <w:t xml:space="preserve"> / Expert</w:t>
+              <w:t xml:space="preserve"> Authoritative / Expert</w:t>
             </w:r>
           </w:p>
         </w:tc>
@@ -3287,15 +2980,7 @@
                 <w:sz w:val="20"/>
                 <w:szCs w:val="20"/>
               </w:rPr>
-              <w:t xml:space="preserve"> Approachable</w:t>
-            </w:r>
-            <w:r>
-              <w:rPr>
-                <w:color w:val="1B1B1B"/>
-                <w:sz w:val="20"/>
-                <w:szCs w:val="20"/>
-              </w:rPr>
-              <w:t xml:space="preserve"> / Conversational</w:t>
+              <w:t xml:space="preserve"> Approachable / Conversational</w:t>
             </w:r>
           </w:p>
         </w:tc>
@@ -3331,15 +3016,7 @@
                 <w:sz w:val="20"/>
                 <w:szCs w:val="20"/>
               </w:rPr>
-              <w:t xml:space="preserve"> Innovative</w:t>
-            </w:r>
-            <w:r>
-              <w:rPr>
-                <w:color w:val="1B1B1B"/>
-                <w:sz w:val="20"/>
-                <w:szCs w:val="20"/>
-              </w:rPr>
-              <w:t xml:space="preserve"> / Visionary</w:t>
+              <w:t xml:space="preserve"> Innovative / Visionary</w:t>
             </w:r>
           </w:p>
         </w:tc>
@@ -3373,12 +3050,6 @@
         <w:gridCol w:w="3120"/>
       </w:tblGrid>
       <w:tr>
-        <w:tblPrEx>
-          <w:tblCellMar>
-            <w:top w:w="0" w:type="dxa"/>
-            <w:bottom w:w="0" w:type="dxa"/>
-          </w:tblCellMar>
-        </w:tblPrEx>
         <w:tc>
           <w:tcPr>
             <w:tcW w:w="3120" w:type="dxa"/>
@@ -3411,15 +3082,7 @@
                 <w:sz w:val="20"/>
                 <w:szCs w:val="20"/>
               </w:rPr>
-              <w:t xml:space="preserve"> Results</w:t>
-            </w:r>
-            <w:r>
-              <w:rPr>
-                <w:color w:val="1B1B1B"/>
-                <w:sz w:val="20"/>
-                <w:szCs w:val="20"/>
-              </w:rPr>
-              <w:t>-Driven / Analytical</w:t>
+              <w:t xml:space="preserve"> Results-Driven / Analytical</w:t>
             </w:r>
           </w:p>
         </w:tc>
@@ -3455,15 +3118,7 @@
                 <w:sz w:val="20"/>
                 <w:szCs w:val="20"/>
               </w:rPr>
-              <w:t xml:space="preserve"> Compassionate</w:t>
-            </w:r>
-            <w:r>
-              <w:rPr>
-                <w:color w:val="1B1B1B"/>
-                <w:sz w:val="20"/>
-                <w:szCs w:val="20"/>
-              </w:rPr>
-              <w:t xml:space="preserve"> / Mission-Driven</w:t>
+              <w:t xml:space="preserve"> Compassionate / Mission-Driven</w:t>
             </w:r>
           </w:p>
         </w:tc>
@@ -3499,15 +3154,7 @@
                 <w:sz w:val="20"/>
                 <w:szCs w:val="20"/>
               </w:rPr>
-              <w:t xml:space="preserve"> Other</w:t>
-            </w:r>
-            <w:r>
-              <w:rPr>
-                <w:color w:val="1B1B1B"/>
-                <w:sz w:val="20"/>
-                <w:szCs w:val="20"/>
-              </w:rPr>
-              <w:t>:</w:t>
+              <w:t xml:space="preserve"> Other:</w:t>
             </w:r>
           </w:p>
         </w:tc>
@@ -3569,12 +3216,6 @@
         <w:gridCol w:w="9360"/>
       </w:tblGrid>
       <w:tr>
-        <w:tblPrEx>
-          <w:tblCellMar>
-            <w:top w:w="0" w:type="dxa"/>
-            <w:bottom w:w="0" w:type="dxa"/>
-          </w:tblCellMar>
-        </w:tblPrEx>
         <w:tc>
           <w:tcPr>
             <w:tcW w:w="9360" w:type="dxa"/>
@@ -3623,12 +3264,6 @@
         <w:gridCol w:w="9160"/>
       </w:tblGrid>
       <w:tr>
-        <w:tblPrEx>
-          <w:tblCellMar>
-            <w:top w:w="0" w:type="dxa"/>
-            <w:bottom w:w="0" w:type="dxa"/>
-          </w:tblCellMar>
-        </w:tblPrEx>
         <w:tc>
           <w:tcPr>
             <w:tcW w:w="200" w:type="dxa"/>
@@ -3704,12 +3339,6 @@
         <w:gridCol w:w="9360"/>
       </w:tblGrid>
       <w:tr>
-        <w:tblPrEx>
-          <w:tblCellMar>
-            <w:top w:w="0" w:type="dxa"/>
-            <w:bottom w:w="0" w:type="dxa"/>
-          </w:tblCellMar>
-        </w:tblPrEx>
         <w:tc>
           <w:tcPr>
             <w:tcW w:w="9360" w:type="dxa"/>
@@ -3747,17 +3376,7 @@
                 <w:sz w:val="18"/>
                 <w:szCs w:val="18"/>
               </w:rPr>
-              <w:t xml:space="preserve"> List</w:t>
-            </w:r>
-            <w:r>
-              <w:rPr>
-                <w:i/>
-                <w:iCs/>
-                <w:color w:val="374151"/>
-                <w:sz w:val="18"/>
-                <w:szCs w:val="18"/>
-              </w:rPr>
-              <w:t xml:space="preserve"> your most recent positions first. Focus on impact over duties — use numbers whenever possible.</w:t>
+              <w:t xml:space="preserve"> List your most recent positions first. Focus on impact over duties — use numbers whenever possible.</w:t>
             </w:r>
           </w:p>
         </w:tc>
@@ -3803,12 +3422,6 @@
         <w:gridCol w:w="4742"/>
       </w:tblGrid>
       <w:tr>
-        <w:tblPrEx>
-          <w:tblCellMar>
-            <w:top w:w="0" w:type="dxa"/>
-            <w:bottom w:w="0" w:type="dxa"/>
-          </w:tblCellMar>
-        </w:tblPrEx>
         <w:tc>
           <w:tcPr>
             <w:tcW w:w="4620" w:type="dxa"/>
@@ -3861,12 +3474,6 @@
               <w:gridCol w:w="4500"/>
             </w:tblGrid>
             <w:tr>
-              <w:tblPrEx>
-                <w:tblCellMar>
-                  <w:top w:w="0" w:type="dxa"/>
-                  <w:bottom w:w="0" w:type="dxa"/>
-                </w:tblCellMar>
-              </w:tblPrEx>
               <w:tc>
                 <w:tcPr>
                   <w:tcW w:w="4500" w:type="dxa"/>
@@ -3943,12 +3550,6 @@
               <w:gridCol w:w="4620"/>
             </w:tblGrid>
             <w:tr>
-              <w:tblPrEx>
-                <w:tblCellMar>
-                  <w:top w:w="0" w:type="dxa"/>
-                  <w:bottom w:w="0" w:type="dxa"/>
-                </w:tblCellMar>
-              </w:tblPrEx>
               <w:tc>
                 <w:tcPr>
                   <w:tcW w:w="4620" w:type="dxa"/>
@@ -4001,12 +3602,6 @@
         <w:gridCol w:w="4742"/>
       </w:tblGrid>
       <w:tr>
-        <w:tblPrEx>
-          <w:tblCellMar>
-            <w:top w:w="0" w:type="dxa"/>
-            <w:bottom w:w="0" w:type="dxa"/>
-          </w:tblCellMar>
-        </w:tblPrEx>
         <w:tc>
           <w:tcPr>
             <w:tcW w:w="4620" w:type="dxa"/>
@@ -4059,12 +3654,6 @@
               <w:gridCol w:w="4500"/>
             </w:tblGrid>
             <w:tr>
-              <w:tblPrEx>
-                <w:tblCellMar>
-                  <w:top w:w="0" w:type="dxa"/>
-                  <w:bottom w:w="0" w:type="dxa"/>
-                </w:tblCellMar>
-              </w:tblPrEx>
               <w:tc>
                 <w:tcPr>
                   <w:tcW w:w="4500" w:type="dxa"/>
@@ -4140,12 +3729,6 @@
               <w:gridCol w:w="4620"/>
             </w:tblGrid>
             <w:tr>
-              <w:tblPrEx>
-                <w:tblCellMar>
-                  <w:top w:w="0" w:type="dxa"/>
-                  <w:bottom w:w="0" w:type="dxa"/>
-                </w:tblCellMar>
-              </w:tblPrEx>
               <w:tc>
                 <w:tcPr>
                   <w:tcW w:w="4620" w:type="dxa"/>
@@ -4198,12 +3781,6 @@
         <w:gridCol w:w="4742"/>
       </w:tblGrid>
       <w:tr>
-        <w:tblPrEx>
-          <w:tblCellMar>
-            <w:top w:w="0" w:type="dxa"/>
-            <w:bottom w:w="0" w:type="dxa"/>
-          </w:tblCellMar>
-        </w:tblPrEx>
         <w:tc>
           <w:tcPr>
             <w:tcW w:w="4620" w:type="dxa"/>
@@ -4256,12 +3833,6 @@
               <w:gridCol w:w="4500"/>
             </w:tblGrid>
             <w:tr>
-              <w:tblPrEx>
-                <w:tblCellMar>
-                  <w:top w:w="0" w:type="dxa"/>
-                  <w:bottom w:w="0" w:type="dxa"/>
-                </w:tblCellMar>
-              </w:tblPrEx>
               <w:tc>
                 <w:tcPr>
                   <w:tcW w:w="4500" w:type="dxa"/>
@@ -4337,12 +3908,6 @@
               <w:gridCol w:w="4620"/>
             </w:tblGrid>
             <w:tr>
-              <w:tblPrEx>
-                <w:tblCellMar>
-                  <w:top w:w="0" w:type="dxa"/>
-                  <w:bottom w:w="0" w:type="dxa"/>
-                </w:tblCellMar>
-              </w:tblPrEx>
               <w:tc>
                 <w:tcPr>
                   <w:tcW w:w="4620" w:type="dxa"/>
@@ -4424,12 +3989,6 @@
         <w:gridCol w:w="9360"/>
       </w:tblGrid>
       <w:tr>
-        <w:tblPrEx>
-          <w:tblCellMar>
-            <w:top w:w="0" w:type="dxa"/>
-            <w:bottom w:w="0" w:type="dxa"/>
-          </w:tblCellMar>
-        </w:tblPrEx>
         <w:tc>
           <w:tcPr>
             <w:tcW w:w="9360" w:type="dxa"/>
@@ -4491,12 +4050,6 @@
         <w:gridCol w:w="4742"/>
       </w:tblGrid>
       <w:tr>
-        <w:tblPrEx>
-          <w:tblCellMar>
-            <w:top w:w="0" w:type="dxa"/>
-            <w:bottom w:w="0" w:type="dxa"/>
-          </w:tblCellMar>
-        </w:tblPrEx>
         <w:tc>
           <w:tcPr>
             <w:tcW w:w="4620" w:type="dxa"/>
@@ -4549,12 +4102,6 @@
               <w:gridCol w:w="4500"/>
             </w:tblGrid>
             <w:tr>
-              <w:tblPrEx>
-                <w:tblCellMar>
-                  <w:top w:w="0" w:type="dxa"/>
-                  <w:bottom w:w="0" w:type="dxa"/>
-                </w:tblCellMar>
-              </w:tblPrEx>
               <w:tc>
                 <w:tcPr>
                   <w:tcW w:w="4500" w:type="dxa"/>
@@ -4630,12 +4177,6 @@
               <w:gridCol w:w="4620"/>
             </w:tblGrid>
             <w:tr>
-              <w:tblPrEx>
-                <w:tblCellMar>
-                  <w:top w:w="0" w:type="dxa"/>
-                  <w:bottom w:w="0" w:type="dxa"/>
-                </w:tblCellMar>
-              </w:tblPrEx>
               <w:tc>
                 <w:tcPr>
                   <w:tcW w:w="4620" w:type="dxa"/>
@@ -4688,12 +4229,6 @@
         <w:gridCol w:w="4742"/>
       </w:tblGrid>
       <w:tr>
-        <w:tblPrEx>
-          <w:tblCellMar>
-            <w:top w:w="0" w:type="dxa"/>
-            <w:bottom w:w="0" w:type="dxa"/>
-          </w:tblCellMar>
-        </w:tblPrEx>
         <w:tc>
           <w:tcPr>
             <w:tcW w:w="4620" w:type="dxa"/>
@@ -4746,12 +4281,6 @@
               <w:gridCol w:w="4500"/>
             </w:tblGrid>
             <w:tr>
-              <w:tblPrEx>
-                <w:tblCellMar>
-                  <w:top w:w="0" w:type="dxa"/>
-                  <w:bottom w:w="0" w:type="dxa"/>
-                </w:tblCellMar>
-              </w:tblPrEx>
               <w:tc>
                 <w:tcPr>
                   <w:tcW w:w="4500" w:type="dxa"/>
@@ -4827,12 +4356,6 @@
               <w:gridCol w:w="4620"/>
             </w:tblGrid>
             <w:tr>
-              <w:tblPrEx>
-                <w:tblCellMar>
-                  <w:top w:w="0" w:type="dxa"/>
-                  <w:bottom w:w="0" w:type="dxa"/>
-                </w:tblCellMar>
-              </w:tblPrEx>
               <w:tc>
                 <w:tcPr>
                   <w:tcW w:w="4620" w:type="dxa"/>
@@ -4885,12 +4408,6 @@
         <w:gridCol w:w="4742"/>
       </w:tblGrid>
       <w:tr>
-        <w:tblPrEx>
-          <w:tblCellMar>
-            <w:top w:w="0" w:type="dxa"/>
-            <w:bottom w:w="0" w:type="dxa"/>
-          </w:tblCellMar>
-        </w:tblPrEx>
         <w:tc>
           <w:tcPr>
             <w:tcW w:w="4620" w:type="dxa"/>
@@ -4943,12 +4460,6 @@
               <w:gridCol w:w="4500"/>
             </w:tblGrid>
             <w:tr>
-              <w:tblPrEx>
-                <w:tblCellMar>
-                  <w:top w:w="0" w:type="dxa"/>
-                  <w:bottom w:w="0" w:type="dxa"/>
-                </w:tblCellMar>
-              </w:tblPrEx>
               <w:tc>
                 <w:tcPr>
                   <w:tcW w:w="4500" w:type="dxa"/>
@@ -5024,12 +4535,6 @@
               <w:gridCol w:w="4620"/>
             </w:tblGrid>
             <w:tr>
-              <w:tblPrEx>
-                <w:tblCellMar>
-                  <w:top w:w="0" w:type="dxa"/>
-                  <w:bottom w:w="0" w:type="dxa"/>
-                </w:tblCellMar>
-              </w:tblPrEx>
               <w:tc>
                 <w:tcPr>
                   <w:tcW w:w="4620" w:type="dxa"/>
@@ -5111,12 +4616,6 @@
         <w:gridCol w:w="9360"/>
       </w:tblGrid>
       <w:tr>
-        <w:tblPrEx>
-          <w:tblCellMar>
-            <w:top w:w="0" w:type="dxa"/>
-            <w:bottom w:w="0" w:type="dxa"/>
-          </w:tblCellMar>
-        </w:tblPrEx>
         <w:tc>
           <w:tcPr>
             <w:tcW w:w="9360" w:type="dxa"/>
@@ -5178,12 +4677,6 @@
         <w:gridCol w:w="4742"/>
       </w:tblGrid>
       <w:tr>
-        <w:tblPrEx>
-          <w:tblCellMar>
-            <w:top w:w="0" w:type="dxa"/>
-            <w:bottom w:w="0" w:type="dxa"/>
-          </w:tblCellMar>
-        </w:tblPrEx>
         <w:tc>
           <w:tcPr>
             <w:tcW w:w="4620" w:type="dxa"/>
@@ -5236,12 +4729,6 @@
               <w:gridCol w:w="4500"/>
             </w:tblGrid>
             <w:tr>
-              <w:tblPrEx>
-                <w:tblCellMar>
-                  <w:top w:w="0" w:type="dxa"/>
-                  <w:bottom w:w="0" w:type="dxa"/>
-                </w:tblCellMar>
-              </w:tblPrEx>
               <w:tc>
                 <w:tcPr>
                   <w:tcW w:w="4500" w:type="dxa"/>
@@ -5317,12 +4804,6 @@
               <w:gridCol w:w="4620"/>
             </w:tblGrid>
             <w:tr>
-              <w:tblPrEx>
-                <w:tblCellMar>
-                  <w:top w:w="0" w:type="dxa"/>
-                  <w:bottom w:w="0" w:type="dxa"/>
-                </w:tblCellMar>
-              </w:tblPrEx>
               <w:tc>
                 <w:tcPr>
                   <w:tcW w:w="4620" w:type="dxa"/>
@@ -5375,12 +4856,6 @@
         <w:gridCol w:w="4742"/>
       </w:tblGrid>
       <w:tr>
-        <w:tblPrEx>
-          <w:tblCellMar>
-            <w:top w:w="0" w:type="dxa"/>
-            <w:bottom w:w="0" w:type="dxa"/>
-          </w:tblCellMar>
-        </w:tblPrEx>
         <w:tc>
           <w:tcPr>
             <w:tcW w:w="4620" w:type="dxa"/>
@@ -5433,12 +4908,6 @@
               <w:gridCol w:w="4500"/>
             </w:tblGrid>
             <w:tr>
-              <w:tblPrEx>
-                <w:tblCellMar>
-                  <w:top w:w="0" w:type="dxa"/>
-                  <w:bottom w:w="0" w:type="dxa"/>
-                </w:tblCellMar>
-              </w:tblPrEx>
               <w:tc>
                 <w:tcPr>
                   <w:tcW w:w="4500" w:type="dxa"/>
@@ -5515,12 +4984,6 @@
               <w:gridCol w:w="4620"/>
             </w:tblGrid>
             <w:tr>
-              <w:tblPrEx>
-                <w:tblCellMar>
-                  <w:top w:w="0" w:type="dxa"/>
-                  <w:bottom w:w="0" w:type="dxa"/>
-                </w:tblCellMar>
-              </w:tblPrEx>
               <w:tc>
                 <w:tcPr>
                   <w:tcW w:w="4620" w:type="dxa"/>
@@ -5573,12 +5036,6 @@
         <w:gridCol w:w="4742"/>
       </w:tblGrid>
       <w:tr>
-        <w:tblPrEx>
-          <w:tblCellMar>
-            <w:top w:w="0" w:type="dxa"/>
-            <w:bottom w:w="0" w:type="dxa"/>
-          </w:tblCellMar>
-        </w:tblPrEx>
         <w:tc>
           <w:tcPr>
             <w:tcW w:w="4620" w:type="dxa"/>
@@ -5631,12 +5088,6 @@
               <w:gridCol w:w="4500"/>
             </w:tblGrid>
             <w:tr>
-              <w:tblPrEx>
-                <w:tblCellMar>
-                  <w:top w:w="0" w:type="dxa"/>
-                  <w:bottom w:w="0" w:type="dxa"/>
-                </w:tblCellMar>
-              </w:tblPrEx>
               <w:tc>
                 <w:tcPr>
                   <w:tcW w:w="4500" w:type="dxa"/>
@@ -5712,12 +5163,6 @@
               <w:gridCol w:w="4620"/>
             </w:tblGrid>
             <w:tr>
-              <w:tblPrEx>
-                <w:tblCellMar>
-                  <w:top w:w="0" w:type="dxa"/>
-                  <w:bottom w:w="0" w:type="dxa"/>
-                </w:tblCellMar>
-              </w:tblPrEx>
               <w:tc>
                 <w:tcPr>
                   <w:tcW w:w="4620" w:type="dxa"/>
@@ -5799,12 +5244,6 @@
         <w:gridCol w:w="9360"/>
       </w:tblGrid>
       <w:tr>
-        <w:tblPrEx>
-          <w:tblCellMar>
-            <w:top w:w="0" w:type="dxa"/>
-            <w:bottom w:w="0" w:type="dxa"/>
-          </w:tblCellMar>
-        </w:tblPrEx>
         <w:tc>
           <w:tcPr>
             <w:tcW w:w="9360" w:type="dxa"/>
@@ -5858,12 +5297,6 @@
         <w:gridCol w:w="9160"/>
       </w:tblGrid>
       <w:tr>
-        <w:tblPrEx>
-          <w:tblCellMar>
-            <w:top w:w="0" w:type="dxa"/>
-            <w:bottom w:w="0" w:type="dxa"/>
-          </w:tblCellMar>
-        </w:tblPrEx>
         <w:tc>
           <w:tcPr>
             <w:tcW w:w="200" w:type="dxa"/>
@@ -5953,12 +5386,6 @@
         <w:gridCol w:w="4742"/>
       </w:tblGrid>
       <w:tr>
-        <w:tblPrEx>
-          <w:tblCellMar>
-            <w:top w:w="0" w:type="dxa"/>
-            <w:bottom w:w="0" w:type="dxa"/>
-          </w:tblCellMar>
-        </w:tblPrEx>
         <w:tc>
           <w:tcPr>
             <w:tcW w:w="4620" w:type="dxa"/>
@@ -6011,12 +5438,6 @@
               <w:gridCol w:w="4500"/>
             </w:tblGrid>
             <w:tr>
-              <w:tblPrEx>
-                <w:tblCellMar>
-                  <w:top w:w="0" w:type="dxa"/>
-                  <w:bottom w:w="0" w:type="dxa"/>
-                </w:tblCellMar>
-              </w:tblPrEx>
               <w:tc>
                 <w:tcPr>
                   <w:tcW w:w="4500" w:type="dxa"/>
@@ -6092,12 +5513,6 @@
               <w:gridCol w:w="4620"/>
             </w:tblGrid>
             <w:tr>
-              <w:tblPrEx>
-                <w:tblCellMar>
-                  <w:top w:w="0" w:type="dxa"/>
-                  <w:bottom w:w="0" w:type="dxa"/>
-                </w:tblCellMar>
-              </w:tblPrEx>
               <w:tc>
                 <w:tcPr>
                   <w:tcW w:w="4620" w:type="dxa"/>
@@ -6150,12 +5565,6 @@
         <w:gridCol w:w="4742"/>
       </w:tblGrid>
       <w:tr>
-        <w:tblPrEx>
-          <w:tblCellMar>
-            <w:top w:w="0" w:type="dxa"/>
-            <w:bottom w:w="0" w:type="dxa"/>
-          </w:tblCellMar>
-        </w:tblPrEx>
         <w:tc>
           <w:tcPr>
             <w:tcW w:w="4620" w:type="dxa"/>
@@ -6208,12 +5617,6 @@
               <w:gridCol w:w="4500"/>
             </w:tblGrid>
             <w:tr>
-              <w:tblPrEx>
-                <w:tblCellMar>
-                  <w:top w:w="0" w:type="dxa"/>
-                  <w:bottom w:w="0" w:type="dxa"/>
-                </w:tblCellMar>
-              </w:tblPrEx>
               <w:tc>
                 <w:tcPr>
                   <w:tcW w:w="4500" w:type="dxa"/>
@@ -6289,12 +5692,6 @@
               <w:gridCol w:w="4620"/>
             </w:tblGrid>
             <w:tr>
-              <w:tblPrEx>
-                <w:tblCellMar>
-                  <w:top w:w="0" w:type="dxa"/>
-                  <w:bottom w:w="0" w:type="dxa"/>
-                </w:tblCellMar>
-              </w:tblPrEx>
               <w:tc>
                 <w:tcPr>
                   <w:tcW w:w="4620" w:type="dxa"/>
@@ -6361,12 +5758,6 @@
         <w:gridCol w:w="9360"/>
       </w:tblGrid>
       <w:tr>
-        <w:tblPrEx>
-          <w:tblCellMar>
-            <w:top w:w="0" w:type="dxa"/>
-            <w:bottom w:w="0" w:type="dxa"/>
-          </w:tblCellMar>
-        </w:tblPrEx>
         <w:tc>
           <w:tcPr>
             <w:tcW w:w="9360" w:type="dxa"/>
@@ -6428,12 +5819,6 @@
         <w:gridCol w:w="4742"/>
       </w:tblGrid>
       <w:tr>
-        <w:tblPrEx>
-          <w:tblCellMar>
-            <w:top w:w="0" w:type="dxa"/>
-            <w:bottom w:w="0" w:type="dxa"/>
-          </w:tblCellMar>
-        </w:tblPrEx>
         <w:tc>
           <w:tcPr>
             <w:tcW w:w="4620" w:type="dxa"/>
@@ -6486,12 +5871,6 @@
               <w:gridCol w:w="4500"/>
             </w:tblGrid>
             <w:tr>
-              <w:tblPrEx>
-                <w:tblCellMar>
-                  <w:top w:w="0" w:type="dxa"/>
-                  <w:bottom w:w="0" w:type="dxa"/>
-                </w:tblCellMar>
-              </w:tblPrEx>
               <w:tc>
                 <w:tcPr>
                   <w:tcW w:w="4500" w:type="dxa"/>
@@ -6567,12 +5946,6 @@
               <w:gridCol w:w="4620"/>
             </w:tblGrid>
             <w:tr>
-              <w:tblPrEx>
-                <w:tblCellMar>
-                  <w:top w:w="0" w:type="dxa"/>
-                  <w:bottom w:w="0" w:type="dxa"/>
-                </w:tblCellMar>
-              </w:tblPrEx>
               <w:tc>
                 <w:tcPr>
                   <w:tcW w:w="4620" w:type="dxa"/>
@@ -6625,12 +5998,6 @@
         <w:gridCol w:w="4742"/>
       </w:tblGrid>
       <w:tr>
-        <w:tblPrEx>
-          <w:tblCellMar>
-            <w:top w:w="0" w:type="dxa"/>
-            <w:bottom w:w="0" w:type="dxa"/>
-          </w:tblCellMar>
-        </w:tblPrEx>
         <w:tc>
           <w:tcPr>
             <w:tcW w:w="4620" w:type="dxa"/>
@@ -6683,12 +6050,6 @@
               <w:gridCol w:w="4500"/>
             </w:tblGrid>
             <w:tr>
-              <w:tblPrEx>
-                <w:tblCellMar>
-                  <w:top w:w="0" w:type="dxa"/>
-                  <w:bottom w:w="0" w:type="dxa"/>
-                </w:tblCellMar>
-              </w:tblPrEx>
               <w:tc>
                 <w:tcPr>
                   <w:tcW w:w="4500" w:type="dxa"/>
@@ -6764,12 +6125,6 @@
               <w:gridCol w:w="4620"/>
             </w:tblGrid>
             <w:tr>
-              <w:tblPrEx>
-                <w:tblCellMar>
-                  <w:top w:w="0" w:type="dxa"/>
-                  <w:bottom w:w="0" w:type="dxa"/>
-                </w:tblCellMar>
-              </w:tblPrEx>
               <w:tc>
                 <w:tcPr>
                   <w:tcW w:w="4620" w:type="dxa"/>
@@ -6836,12 +6191,6 @@
         <w:gridCol w:w="9360"/>
       </w:tblGrid>
       <w:tr>
-        <w:tblPrEx>
-          <w:tblCellMar>
-            <w:top w:w="0" w:type="dxa"/>
-            <w:bottom w:w="0" w:type="dxa"/>
-          </w:tblCellMar>
-        </w:tblPrEx>
         <w:tc>
           <w:tcPr>
             <w:tcW w:w="9360" w:type="dxa"/>
@@ -6890,12 +6239,6 @@
         <w:gridCol w:w="9160"/>
       </w:tblGrid>
       <w:tr>
-        <w:tblPrEx>
-          <w:tblCellMar>
-            <w:top w:w="0" w:type="dxa"/>
-            <w:bottom w:w="0" w:type="dxa"/>
-          </w:tblCellMar>
-        </w:tblPrEx>
         <w:tc>
           <w:tcPr>
             <w:tcW w:w="200" w:type="dxa"/>
@@ -6971,12 +6314,6 @@
         <w:gridCol w:w="9360"/>
       </w:tblGrid>
       <w:tr>
-        <w:tblPrEx>
-          <w:tblCellMar>
-            <w:top w:w="0" w:type="dxa"/>
-            <w:bottom w:w="0" w:type="dxa"/>
-          </w:tblCellMar>
-        </w:tblPrEx>
         <w:tc>
           <w:tcPr>
             <w:tcW w:w="9360" w:type="dxa"/>
@@ -7014,17 +6351,7 @@
                 <w:sz w:val="18"/>
                 <w:szCs w:val="18"/>
               </w:rPr>
-              <w:t xml:space="preserve"> LinkedIn</w:t>
-            </w:r>
-            <w:r>
-              <w:rPr>
-                <w:i/>
-                <w:iCs/>
-                <w:color w:val="374151"/>
-                <w:sz w:val="18"/>
-                <w:szCs w:val="18"/>
-              </w:rPr>
-              <w:t xml:space="preserve"> allows up to 50 skills. List the most relevant to your goals — prioritize quality over quantity.</w:t>
+              <w:t xml:space="preserve"> LinkedIn allows up to 50 skills. List the most relevant to your goals — prioritize quality over quantity.</w:t>
             </w:r>
           </w:p>
         </w:tc>
@@ -7071,12 +6398,6 @@
         <w:gridCol w:w="9360"/>
       </w:tblGrid>
       <w:tr>
-        <w:tblPrEx>
-          <w:tblCellMar>
-            <w:top w:w="0" w:type="dxa"/>
-            <w:bottom w:w="0" w:type="dxa"/>
-          </w:tblCellMar>
-        </w:tblPrEx>
         <w:tc>
           <w:tcPr>
             <w:tcW w:w="9360" w:type="dxa"/>
@@ -7139,12 +6460,6 @@
         <w:gridCol w:w="9360"/>
       </w:tblGrid>
       <w:tr>
-        <w:tblPrEx>
-          <w:tblCellMar>
-            <w:top w:w="0" w:type="dxa"/>
-            <w:bottom w:w="0" w:type="dxa"/>
-          </w:tblCellMar>
-        </w:tblPrEx>
         <w:tc>
           <w:tcPr>
             <w:tcW w:w="9360" w:type="dxa"/>
@@ -7214,12 +6529,6 @@
         <w:gridCol w:w="3120"/>
       </w:tblGrid>
       <w:tr>
-        <w:tblPrEx>
-          <w:tblCellMar>
-            <w:top w:w="0" w:type="dxa"/>
-            <w:bottom w:w="0" w:type="dxa"/>
-          </w:tblCellMar>
-        </w:tblPrEx>
         <w:tc>
           <w:tcPr>
             <w:tcW w:w="3120" w:type="dxa"/>
@@ -7252,15 +6561,7 @@
                 <w:sz w:val="20"/>
                 <w:szCs w:val="20"/>
               </w:rPr>
-              <w:t xml:space="preserve"> Yes</w:t>
-            </w:r>
-            <w:r>
-              <w:rPr>
-                <w:color w:val="1B1B1B"/>
-                <w:sz w:val="20"/>
-                <w:szCs w:val="20"/>
-              </w:rPr>
-              <w:t xml:space="preserve"> — I will reach out to them</w:t>
+              <w:t xml:space="preserve"> Yes — I will reach out to them</w:t>
             </w:r>
           </w:p>
         </w:tc>
@@ -7296,15 +6597,7 @@
                 <w:sz w:val="20"/>
                 <w:szCs w:val="20"/>
               </w:rPr>
-              <w:t xml:space="preserve"> Possibly</w:t>
-            </w:r>
-            <w:r>
-              <w:rPr>
-                <w:color w:val="1B1B1B"/>
-                <w:sz w:val="20"/>
-                <w:szCs w:val="20"/>
-              </w:rPr>
-              <w:t xml:space="preserve"> — need guidance on how to ask</w:t>
+              <w:t xml:space="preserve"> Possibly — need guidance on how to ask</w:t>
             </w:r>
           </w:p>
         </w:tc>
@@ -7340,15 +6633,7 @@
                 <w:sz w:val="20"/>
                 <w:szCs w:val="20"/>
               </w:rPr>
-              <w:t xml:space="preserve"> No</w:t>
-            </w:r>
-            <w:r>
-              <w:rPr>
-                <w:color w:val="1B1B1B"/>
-                <w:sz w:val="20"/>
-                <w:szCs w:val="20"/>
-              </w:rPr>
-              <w:t xml:space="preserve"> / Not at this time</w:t>
+              <w:t xml:space="preserve"> No / Not at this time</w:t>
             </w:r>
           </w:p>
         </w:tc>
@@ -7381,12 +6666,6 @@
         <w:gridCol w:w="9160"/>
       </w:tblGrid>
       <w:tr>
-        <w:tblPrEx>
-          <w:tblCellMar>
-            <w:top w:w="0" w:type="dxa"/>
-            <w:bottom w:w="0" w:type="dxa"/>
-          </w:tblCellMar>
-        </w:tblPrEx>
         <w:tc>
           <w:tcPr>
             <w:tcW w:w="200" w:type="dxa"/>
@@ -7476,12 +6755,6 @@
         <w:gridCol w:w="4742"/>
       </w:tblGrid>
       <w:tr>
-        <w:tblPrEx>
-          <w:tblCellMar>
-            <w:top w:w="0" w:type="dxa"/>
-            <w:bottom w:w="0" w:type="dxa"/>
-          </w:tblCellMar>
-        </w:tblPrEx>
         <w:tc>
           <w:tcPr>
             <w:tcW w:w="4620" w:type="dxa"/>
@@ -7534,12 +6807,6 @@
               <w:gridCol w:w="4500"/>
             </w:tblGrid>
             <w:tr>
-              <w:tblPrEx>
-                <w:tblCellMar>
-                  <w:top w:w="0" w:type="dxa"/>
-                  <w:bottom w:w="0" w:type="dxa"/>
-                </w:tblCellMar>
-              </w:tblPrEx>
               <w:tc>
                 <w:tcPr>
                   <w:tcW w:w="4500" w:type="dxa"/>
@@ -7615,12 +6882,6 @@
               <w:gridCol w:w="4620"/>
             </w:tblGrid>
             <w:tr>
-              <w:tblPrEx>
-                <w:tblCellMar>
-                  <w:top w:w="0" w:type="dxa"/>
-                  <w:bottom w:w="0" w:type="dxa"/>
-                </w:tblCellMar>
-              </w:tblPrEx>
               <w:tc>
                 <w:tcPr>
                   <w:tcW w:w="4620" w:type="dxa"/>
@@ -7673,12 +6934,6 @@
         <w:gridCol w:w="4742"/>
       </w:tblGrid>
       <w:tr>
-        <w:tblPrEx>
-          <w:tblCellMar>
-            <w:top w:w="0" w:type="dxa"/>
-            <w:bottom w:w="0" w:type="dxa"/>
-          </w:tblCellMar>
-        </w:tblPrEx>
         <w:tc>
           <w:tcPr>
             <w:tcW w:w="4620" w:type="dxa"/>
@@ -7731,12 +6986,6 @@
               <w:gridCol w:w="4500"/>
             </w:tblGrid>
             <w:tr>
-              <w:tblPrEx>
-                <w:tblCellMar>
-                  <w:top w:w="0" w:type="dxa"/>
-                  <w:bottom w:w="0" w:type="dxa"/>
-                </w:tblCellMar>
-              </w:tblPrEx>
               <w:tc>
                 <w:tcPr>
                   <w:tcW w:w="4500" w:type="dxa"/>
@@ -7812,12 +7061,6 @@
               <w:gridCol w:w="4620"/>
             </w:tblGrid>
             <w:tr>
-              <w:tblPrEx>
-                <w:tblCellMar>
-                  <w:top w:w="0" w:type="dxa"/>
-                  <w:bottom w:w="0" w:type="dxa"/>
-                </w:tblCellMar>
-              </w:tblPrEx>
               <w:tc>
                 <w:tcPr>
                   <w:tcW w:w="4620" w:type="dxa"/>
@@ -7883,12 +7126,6 @@
         <w:gridCol w:w="4742"/>
       </w:tblGrid>
       <w:tr>
-        <w:tblPrEx>
-          <w:tblCellMar>
-            <w:top w:w="0" w:type="dxa"/>
-            <w:bottom w:w="0" w:type="dxa"/>
-          </w:tblCellMar>
-        </w:tblPrEx>
         <w:tc>
           <w:tcPr>
             <w:tcW w:w="4620" w:type="dxa"/>
@@ -7941,12 +7178,6 @@
               <w:gridCol w:w="4500"/>
             </w:tblGrid>
             <w:tr>
-              <w:tblPrEx>
-                <w:tblCellMar>
-                  <w:top w:w="0" w:type="dxa"/>
-                  <w:bottom w:w="0" w:type="dxa"/>
-                </w:tblCellMar>
-              </w:tblPrEx>
               <w:tc>
                 <w:tcPr>
                   <w:tcW w:w="4500" w:type="dxa"/>
@@ -8022,12 +7253,6 @@
               <w:gridCol w:w="4620"/>
             </w:tblGrid>
             <w:tr>
-              <w:tblPrEx>
-                <w:tblCellMar>
-                  <w:top w:w="0" w:type="dxa"/>
-                  <w:bottom w:w="0" w:type="dxa"/>
-                </w:tblCellMar>
-              </w:tblPrEx>
               <w:tc>
                 <w:tcPr>
                   <w:tcW w:w="4620" w:type="dxa"/>
@@ -8080,12 +7305,6 @@
         <w:gridCol w:w="4742"/>
       </w:tblGrid>
       <w:tr>
-        <w:tblPrEx>
-          <w:tblCellMar>
-            <w:top w:w="0" w:type="dxa"/>
-            <w:bottom w:w="0" w:type="dxa"/>
-          </w:tblCellMar>
-        </w:tblPrEx>
         <w:tc>
           <w:tcPr>
             <w:tcW w:w="4620" w:type="dxa"/>
@@ -8138,12 +7357,6 @@
               <w:gridCol w:w="4500"/>
             </w:tblGrid>
             <w:tr>
-              <w:tblPrEx>
-                <w:tblCellMar>
-                  <w:top w:w="0" w:type="dxa"/>
-                  <w:bottom w:w="0" w:type="dxa"/>
-                </w:tblCellMar>
-              </w:tblPrEx>
               <w:tc>
                 <w:tcPr>
                   <w:tcW w:w="4500" w:type="dxa"/>
@@ -8219,12 +7432,6 @@
               <w:gridCol w:w="4620"/>
             </w:tblGrid>
             <w:tr>
-              <w:tblPrEx>
-                <w:tblCellMar>
-                  <w:top w:w="0" w:type="dxa"/>
-                  <w:bottom w:w="0" w:type="dxa"/>
-                </w:tblCellMar>
-              </w:tblPrEx>
               <w:tc>
                 <w:tcPr>
                   <w:tcW w:w="4620" w:type="dxa"/>
@@ -8291,12 +7498,6 @@
         <w:gridCol w:w="4742"/>
       </w:tblGrid>
       <w:tr>
-        <w:tblPrEx>
-          <w:tblCellMar>
-            <w:top w:w="0" w:type="dxa"/>
-            <w:bottom w:w="0" w:type="dxa"/>
-          </w:tblCellMar>
-        </w:tblPrEx>
         <w:tc>
           <w:tcPr>
             <w:tcW w:w="4620" w:type="dxa"/>
@@ -8349,12 +7550,6 @@
               <w:gridCol w:w="4500"/>
             </w:tblGrid>
             <w:tr>
-              <w:tblPrEx>
-                <w:tblCellMar>
-                  <w:top w:w="0" w:type="dxa"/>
-                  <w:bottom w:w="0" w:type="dxa"/>
-                </w:tblCellMar>
-              </w:tblPrEx>
               <w:tc>
                 <w:tcPr>
                   <w:tcW w:w="4500" w:type="dxa"/>
@@ -8430,12 +7625,6 @@
               <w:gridCol w:w="4620"/>
             </w:tblGrid>
             <w:tr>
-              <w:tblPrEx>
-                <w:tblCellMar>
-                  <w:top w:w="0" w:type="dxa"/>
-                  <w:bottom w:w="0" w:type="dxa"/>
-                </w:tblCellMar>
-              </w:tblPrEx>
               <w:tc>
                 <w:tcPr>
                   <w:tcW w:w="4620" w:type="dxa"/>
@@ -8488,12 +7677,6 @@
         <w:gridCol w:w="4742"/>
       </w:tblGrid>
       <w:tr>
-        <w:tblPrEx>
-          <w:tblCellMar>
-            <w:top w:w="0" w:type="dxa"/>
-            <w:bottom w:w="0" w:type="dxa"/>
-          </w:tblCellMar>
-        </w:tblPrEx>
         <w:tc>
           <w:tcPr>
             <w:tcW w:w="4620" w:type="dxa"/>
@@ -8546,12 +7729,6 @@
               <w:gridCol w:w="4500"/>
             </w:tblGrid>
             <w:tr>
-              <w:tblPrEx>
-                <w:tblCellMar>
-                  <w:top w:w="0" w:type="dxa"/>
-                  <w:bottom w:w="0" w:type="dxa"/>
-                </w:tblCellMar>
-              </w:tblPrEx>
               <w:tc>
                 <w:tcPr>
                   <w:tcW w:w="4500" w:type="dxa"/>
@@ -8627,12 +7804,6 @@
               <w:gridCol w:w="4620"/>
             </w:tblGrid>
             <w:tr>
-              <w:tblPrEx>
-                <w:tblCellMar>
-                  <w:top w:w="0" w:type="dxa"/>
-                  <w:bottom w:w="0" w:type="dxa"/>
-                </w:tblCellMar>
-              </w:tblPrEx>
               <w:tc>
                 <w:tcPr>
                   <w:tcW w:w="4620" w:type="dxa"/>
@@ -8685,12 +7856,6 @@
         <w:gridCol w:w="9160"/>
       </w:tblGrid>
       <w:tr>
-        <w:tblPrEx>
-          <w:tblCellMar>
-            <w:top w:w="0" w:type="dxa"/>
-            <w:bottom w:w="0" w:type="dxa"/>
-          </w:tblCellMar>
-        </w:tblPrEx>
         <w:tc>
           <w:tcPr>
             <w:tcW w:w="200" w:type="dxa"/>
@@ -8766,12 +7931,6 @@
         <w:gridCol w:w="9360"/>
       </w:tblGrid>
       <w:tr>
-        <w:tblPrEx>
-          <w:tblCellMar>
-            <w:top w:w="0" w:type="dxa"/>
-            <w:bottom w:w="0" w:type="dxa"/>
-          </w:tblCellMar>
-        </w:tblPrEx>
         <w:tc>
           <w:tcPr>
             <w:tcW w:w="9360" w:type="dxa"/>
@@ -8809,17 +7968,7 @@
                 <w:sz w:val="18"/>
                 <w:szCs w:val="18"/>
               </w:rPr>
-              <w:t xml:space="preserve"> The</w:t>
-            </w:r>
-            <w:r>
-              <w:rPr>
-                <w:i/>
-                <w:iCs/>
-                <w:color w:val="374151"/>
-                <w:sz w:val="18"/>
-                <w:szCs w:val="18"/>
-              </w:rPr>
-              <w:t xml:space="preserve"> Featured section lets you pin posts, articles, links, or media at the top of your profile. Prime real estate — use it wisely.</w:t>
+              <w:t xml:space="preserve"> The Featured section lets you pin posts, articles, links, or media at the top of your profile. Prime real estate — use it wisely.</w:t>
             </w:r>
           </w:p>
         </w:tc>
@@ -8881,12 +8030,6 @@
         <w:gridCol w:w="9360"/>
       </w:tblGrid>
       <w:tr>
-        <w:tblPrEx>
-          <w:tblCellMar>
-            <w:top w:w="0" w:type="dxa"/>
-            <w:bottom w:w="0" w:type="dxa"/>
-          </w:tblCellMar>
-        </w:tblPrEx>
         <w:tc>
           <w:tcPr>
             <w:tcW w:w="9360" w:type="dxa"/>
@@ -8935,12 +8078,6 @@
         <w:gridCol w:w="9160"/>
       </w:tblGrid>
       <w:tr>
-        <w:tblPrEx>
-          <w:tblCellMar>
-            <w:top w:w="0" w:type="dxa"/>
-            <w:bottom w:w="0" w:type="dxa"/>
-          </w:tblCellMar>
-        </w:tblPrEx>
         <w:tc>
           <w:tcPr>
             <w:tcW w:w="200" w:type="dxa"/>
@@ -9017,12 +8154,6 @@
         <w:gridCol w:w="4742"/>
       </w:tblGrid>
       <w:tr>
-        <w:tblPrEx>
-          <w:tblCellMar>
-            <w:top w:w="0" w:type="dxa"/>
-            <w:bottom w:w="0" w:type="dxa"/>
-          </w:tblCellMar>
-        </w:tblPrEx>
         <w:tc>
           <w:tcPr>
             <w:tcW w:w="4620" w:type="dxa"/>
@@ -9075,12 +8206,6 @@
               <w:gridCol w:w="4500"/>
             </w:tblGrid>
             <w:tr>
-              <w:tblPrEx>
-                <w:tblCellMar>
-                  <w:top w:w="0" w:type="dxa"/>
-                  <w:bottom w:w="0" w:type="dxa"/>
-                </w:tblCellMar>
-              </w:tblPrEx>
               <w:tc>
                 <w:tcPr>
                   <w:tcW w:w="4500" w:type="dxa"/>
@@ -9156,12 +8281,6 @@
               <w:gridCol w:w="4620"/>
             </w:tblGrid>
             <w:tr>
-              <w:tblPrEx>
-                <w:tblCellMar>
-                  <w:top w:w="0" w:type="dxa"/>
-                  <w:bottom w:w="0" w:type="dxa"/>
-                </w:tblCellMar>
-              </w:tblPrEx>
               <w:tc>
                 <w:tcPr>
                   <w:tcW w:w="4620" w:type="dxa"/>
@@ -9214,12 +8333,6 @@
         <w:gridCol w:w="4742"/>
       </w:tblGrid>
       <w:tr>
-        <w:tblPrEx>
-          <w:tblCellMar>
-            <w:top w:w="0" w:type="dxa"/>
-            <w:bottom w:w="0" w:type="dxa"/>
-          </w:tblCellMar>
-        </w:tblPrEx>
         <w:tc>
           <w:tcPr>
             <w:tcW w:w="4620" w:type="dxa"/>
@@ -9272,12 +8385,6 @@
               <w:gridCol w:w="4500"/>
             </w:tblGrid>
             <w:tr>
-              <w:tblPrEx>
-                <w:tblCellMar>
-                  <w:top w:w="0" w:type="dxa"/>
-                  <w:bottom w:w="0" w:type="dxa"/>
-                </w:tblCellMar>
-              </w:tblPrEx>
               <w:tc>
                 <w:tcPr>
                   <w:tcW w:w="4500" w:type="dxa"/>
@@ -9353,12 +8460,6 @@
               <w:gridCol w:w="4620"/>
             </w:tblGrid>
             <w:tr>
-              <w:tblPrEx>
-                <w:tblCellMar>
-                  <w:top w:w="0" w:type="dxa"/>
-                  <w:bottom w:w="0" w:type="dxa"/>
-                </w:tblCellMar>
-              </w:tblPrEx>
               <w:tc>
                 <w:tcPr>
                   <w:tcW w:w="4620" w:type="dxa"/>
@@ -9411,12 +8512,6 @@
         <w:gridCol w:w="4742"/>
       </w:tblGrid>
       <w:tr>
-        <w:tblPrEx>
-          <w:tblCellMar>
-            <w:top w:w="0" w:type="dxa"/>
-            <w:bottom w:w="0" w:type="dxa"/>
-          </w:tblCellMar>
-        </w:tblPrEx>
         <w:tc>
           <w:tcPr>
             <w:tcW w:w="4620" w:type="dxa"/>
@@ -9469,12 +8564,6 @@
               <w:gridCol w:w="4500"/>
             </w:tblGrid>
             <w:tr>
-              <w:tblPrEx>
-                <w:tblCellMar>
-                  <w:top w:w="0" w:type="dxa"/>
-                  <w:bottom w:w="0" w:type="dxa"/>
-                </w:tblCellMar>
-              </w:tblPrEx>
               <w:tc>
                 <w:tcPr>
                   <w:tcW w:w="4500" w:type="dxa"/>
@@ -9570,12 +8659,6 @@
               <w:gridCol w:w="4620"/>
             </w:tblGrid>
             <w:tr>
-              <w:tblPrEx>
-                <w:tblCellMar>
-                  <w:top w:w="0" w:type="dxa"/>
-                  <w:bottom w:w="0" w:type="dxa"/>
-                </w:tblCellMar>
-              </w:tblPrEx>
               <w:tc>
                 <w:tcPr>
                   <w:tcW w:w="4620" w:type="dxa"/>
@@ -9642,12 +8725,6 @@
         <w:gridCol w:w="9360"/>
       </w:tblGrid>
       <w:tr>
-        <w:tblPrEx>
-          <w:tblCellMar>
-            <w:top w:w="0" w:type="dxa"/>
-            <w:bottom w:w="0" w:type="dxa"/>
-          </w:tblCellMar>
-        </w:tblPrEx>
         <w:tc>
           <w:tcPr>
             <w:tcW w:w="9360" w:type="dxa"/>
@@ -9696,12 +8773,6 @@
         <w:gridCol w:w="9160"/>
       </w:tblGrid>
       <w:tr>
-        <w:tblPrEx>
-          <w:tblCellMar>
-            <w:top w:w="0" w:type="dxa"/>
-            <w:bottom w:w="0" w:type="dxa"/>
-          </w:tblCellMar>
-        </w:tblPrEx>
         <w:tc>
           <w:tcPr>
             <w:tcW w:w="200" w:type="dxa"/>
@@ -9799,12 +8870,6 @@
         <w:gridCol w:w="3120"/>
       </w:tblGrid>
       <w:tr>
-        <w:tblPrEx>
-          <w:tblCellMar>
-            <w:top w:w="0" w:type="dxa"/>
-            <w:bottom w:w="0" w:type="dxa"/>
-          </w:tblCellMar>
-        </w:tblPrEx>
         <w:tc>
           <w:tcPr>
             <w:tcW w:w="3120" w:type="dxa"/>
@@ -9837,15 +8902,7 @@
                 <w:sz w:val="20"/>
                 <w:szCs w:val="20"/>
               </w:rPr>
-              <w:t xml:space="preserve"> Yes</w:t>
-            </w:r>
-            <w:r>
-              <w:rPr>
-                <w:color w:val="1B1B1B"/>
-                <w:sz w:val="20"/>
-                <w:szCs w:val="20"/>
-              </w:rPr>
-              <w:t xml:space="preserve"> — regularly (3–5x/week)</w:t>
+              <w:t xml:space="preserve"> Yes — regularly (3–5x/week)</w:t>
             </w:r>
           </w:p>
         </w:tc>
@@ -9881,15 +8938,7 @@
                 <w:sz w:val="20"/>
                 <w:szCs w:val="20"/>
               </w:rPr>
-              <w:t xml:space="preserve"> Yes</w:t>
-            </w:r>
-            <w:r>
-              <w:rPr>
-                <w:color w:val="1B1B1B"/>
-                <w:sz w:val="20"/>
-                <w:szCs w:val="20"/>
-              </w:rPr>
-              <w:t xml:space="preserve"> — occasionally (1–2x/week)</w:t>
+              <w:t xml:space="preserve"> Yes — occasionally (1–2x/week)</w:t>
             </w:r>
           </w:p>
         </w:tc>
@@ -9925,15 +8974,7 @@
                 <w:sz w:val="20"/>
                 <w:szCs w:val="20"/>
               </w:rPr>
-              <w:t xml:space="preserve"> Rarely</w:t>
-            </w:r>
-            <w:r>
-              <w:rPr>
-                <w:color w:val="1B1B1B"/>
-                <w:sz w:val="20"/>
-                <w:szCs w:val="20"/>
-              </w:rPr>
-              <w:t xml:space="preserve"> / Profile only</w:t>
+              <w:t xml:space="preserve"> Rarely / Profile only</w:t>
             </w:r>
           </w:p>
         </w:tc>
@@ -9980,12 +9021,6 @@
         <w:gridCol w:w="9360"/>
       </w:tblGrid>
       <w:tr>
-        <w:tblPrEx>
-          <w:tblCellMar>
-            <w:top w:w="0" w:type="dxa"/>
-            <w:bottom w:w="0" w:type="dxa"/>
-          </w:tblCellMar>
-        </w:tblPrEx>
         <w:tc>
           <w:tcPr>
             <w:tcW w:w="9360" w:type="dxa"/>
@@ -10055,12 +9090,6 @@
         <w:gridCol w:w="3120"/>
       </w:tblGrid>
       <w:tr>
-        <w:tblPrEx>
-          <w:tblCellMar>
-            <w:top w:w="0" w:type="dxa"/>
-            <w:bottom w:w="0" w:type="dxa"/>
-          </w:tblCellMar>
-        </w:tblPrEx>
         <w:tc>
           <w:tcPr>
             <w:tcW w:w="3120" w:type="dxa"/>
@@ -10093,15 +9122,7 @@
                 <w:sz w:val="20"/>
                 <w:szCs w:val="20"/>
               </w:rPr>
-              <w:t xml:space="preserve"> Short</w:t>
-            </w:r>
-            <w:r>
-              <w:rPr>
-                <w:color w:val="1B1B1B"/>
-                <w:sz w:val="20"/>
-                <w:szCs w:val="20"/>
-              </w:rPr>
-              <w:t xml:space="preserve"> text posts</w:t>
+              <w:t xml:space="preserve"> Short text posts</w:t>
             </w:r>
           </w:p>
         </w:tc>
@@ -10137,15 +9158,7 @@
                 <w:sz w:val="20"/>
                 <w:szCs w:val="20"/>
               </w:rPr>
-              <w:t xml:space="preserve"> Long</w:t>
-            </w:r>
-            <w:r>
-              <w:rPr>
-                <w:color w:val="1B1B1B"/>
-                <w:sz w:val="20"/>
-                <w:szCs w:val="20"/>
-              </w:rPr>
-              <w:t>-form articles</w:t>
+              <w:t xml:space="preserve"> Long-form articles</w:t>
             </w:r>
           </w:p>
         </w:tc>
@@ -10181,15 +9194,7 @@
                 <w:sz w:val="20"/>
                 <w:szCs w:val="20"/>
               </w:rPr>
-              <w:t xml:space="preserve"> Carousels</w:t>
-            </w:r>
-            <w:r>
-              <w:rPr>
-                <w:color w:val="1B1B1B"/>
-                <w:sz w:val="20"/>
-                <w:szCs w:val="20"/>
-              </w:rPr>
-              <w:t xml:space="preserve"> / Slide posts</w:t>
+              <w:t xml:space="preserve"> Carousels / Slide posts</w:t>
             </w:r>
           </w:p>
         </w:tc>
@@ -10223,12 +9228,6 @@
         <w:gridCol w:w="3120"/>
       </w:tblGrid>
       <w:tr>
-        <w:tblPrEx>
-          <w:tblCellMar>
-            <w:top w:w="0" w:type="dxa"/>
-            <w:bottom w:w="0" w:type="dxa"/>
-          </w:tblCellMar>
-        </w:tblPrEx>
         <w:tc>
           <w:tcPr>
             <w:tcW w:w="3120" w:type="dxa"/>
@@ -10261,15 +9260,7 @@
                 <w:sz w:val="20"/>
                 <w:szCs w:val="20"/>
               </w:rPr>
-              <w:t xml:space="preserve"> Short</w:t>
-            </w:r>
-            <w:r>
-              <w:rPr>
-                <w:color w:val="1B1B1B"/>
-                <w:sz w:val="20"/>
-                <w:szCs w:val="20"/>
-              </w:rPr>
-              <w:t xml:space="preserve"> videos</w:t>
+              <w:t xml:space="preserve"> Short videos</w:t>
             </w:r>
           </w:p>
         </w:tc>
@@ -10341,15 +9332,7 @@
                 <w:sz w:val="20"/>
                 <w:szCs w:val="20"/>
               </w:rPr>
-              <w:t xml:space="preserve"> Sharing</w:t>
-            </w:r>
-            <w:r>
-              <w:rPr>
-                <w:color w:val="1B1B1B"/>
-                <w:sz w:val="20"/>
-                <w:szCs w:val="20"/>
-              </w:rPr>
-              <w:t xml:space="preserve"> content with commentary</w:t>
+              <w:t xml:space="preserve"> Sharing content with commentary</w:t>
             </w:r>
           </w:p>
         </w:tc>
@@ -10418,12 +9401,6 @@
         <w:gridCol w:w="3120"/>
       </w:tblGrid>
       <w:tr>
-        <w:tblPrEx>
-          <w:tblCellMar>
-            <w:top w:w="0" w:type="dxa"/>
-            <w:bottom w:w="0" w:type="dxa"/>
-          </w:tblCellMar>
-        </w:tblPrEx>
         <w:tc>
           <w:tcPr>
             <w:tcW w:w="3120" w:type="dxa"/>
@@ -10528,15 +9505,7 @@
                 <w:sz w:val="20"/>
                 <w:szCs w:val="20"/>
               </w:rPr>
-              <w:t xml:space="preserve"> Not</w:t>
-            </w:r>
-            <w:r>
-              <w:rPr>
-                <w:color w:val="1B1B1B"/>
-                <w:sz w:val="20"/>
-                <w:szCs w:val="20"/>
-              </w:rPr>
-              <w:t xml:space="preserve"> sure — please explain the benefits</w:t>
+              <w:t xml:space="preserve"> Not sure — please explain the benefits</w:t>
             </w:r>
           </w:p>
         </w:tc>
@@ -10569,12 +9538,6 @@
         <w:gridCol w:w="9160"/>
       </w:tblGrid>
       <w:tr>
-        <w:tblPrEx>
-          <w:tblCellMar>
-            <w:top w:w="0" w:type="dxa"/>
-            <w:bottom w:w="0" w:type="dxa"/>
-          </w:tblCellMar>
-        </w:tblPrEx>
         <w:tc>
           <w:tcPr>
             <w:tcW w:w="200" w:type="dxa"/>
@@ -10672,12 +9635,6 @@
         <w:gridCol w:w="3120"/>
       </w:tblGrid>
       <w:tr>
-        <w:tblPrEx>
-          <w:tblCellMar>
-            <w:top w:w="0" w:type="dxa"/>
-            <w:bottom w:w="0" w:type="dxa"/>
-          </w:tblCellMar>
-        </w:tblPrEx>
         <w:tc>
           <w:tcPr>
             <w:tcW w:w="3120" w:type="dxa"/>
@@ -10710,15 +9667,7 @@
                 <w:sz w:val="20"/>
                 <w:szCs w:val="20"/>
               </w:rPr>
-              <w:t xml:space="preserve"> New</w:t>
-            </w:r>
-            <w:r>
-              <w:rPr>
-                <w:color w:val="1B1B1B"/>
-                <w:sz w:val="20"/>
-                <w:szCs w:val="20"/>
-              </w:rPr>
-              <w:t xml:space="preserve"> job / career pivot</w:t>
+              <w:t xml:space="preserve"> New job / career pivot</w:t>
             </w:r>
           </w:p>
         </w:tc>
@@ -10754,15 +9703,7 @@
                 <w:sz w:val="20"/>
                 <w:szCs w:val="20"/>
               </w:rPr>
-              <w:t xml:space="preserve"> Business</w:t>
-            </w:r>
-            <w:r>
-              <w:rPr>
-                <w:color w:val="1B1B1B"/>
-                <w:sz w:val="20"/>
-                <w:szCs w:val="20"/>
-              </w:rPr>
-              <w:t xml:space="preserve"> development / leads</w:t>
+              <w:t xml:space="preserve"> Business development / leads</w:t>
             </w:r>
           </w:p>
         </w:tc>
@@ -10798,15 +9739,7 @@
                 <w:sz w:val="20"/>
                 <w:szCs w:val="20"/>
               </w:rPr>
-              <w:t xml:space="preserve"> Thought</w:t>
-            </w:r>
-            <w:r>
-              <w:rPr>
-                <w:color w:val="1B1B1B"/>
-                <w:sz w:val="20"/>
-                <w:szCs w:val="20"/>
-              </w:rPr>
-              <w:t xml:space="preserve"> leadership / speaking</w:t>
+              <w:t xml:space="preserve"> Thought leadership / speaking</w:t>
             </w:r>
           </w:p>
         </w:tc>
@@ -10840,12 +9773,6 @@
         <w:gridCol w:w="3120"/>
       </w:tblGrid>
       <w:tr>
-        <w:tblPrEx>
-          <w:tblCellMar>
-            <w:top w:w="0" w:type="dxa"/>
-            <w:bottom w:w="0" w:type="dxa"/>
-          </w:tblCellMar>
-        </w:tblPrEx>
         <w:tc>
           <w:tcPr>
             <w:tcW w:w="3120" w:type="dxa"/>
@@ -10878,15 +9805,7 @@
                 <w:sz w:val="20"/>
                 <w:szCs w:val="20"/>
               </w:rPr>
-              <w:t xml:space="preserve"> Networking</w:t>
-            </w:r>
-            <w:r>
-              <w:rPr>
-                <w:color w:val="1B1B1B"/>
-                <w:sz w:val="20"/>
-                <w:szCs w:val="20"/>
-              </w:rPr>
-              <w:t xml:space="preserve"> / community</w:t>
+              <w:t xml:space="preserve"> Networking / community</w:t>
             </w:r>
           </w:p>
         </w:tc>
@@ -10922,15 +9841,7 @@
                 <w:sz w:val="20"/>
                 <w:szCs w:val="20"/>
               </w:rPr>
-              <w:t xml:space="preserve"> Recruiting</w:t>
-            </w:r>
-            <w:r>
-              <w:rPr>
-                <w:color w:val="1B1B1B"/>
-                <w:sz w:val="20"/>
-                <w:szCs w:val="20"/>
-              </w:rPr>
-              <w:t xml:space="preserve"> talent</w:t>
+              <w:t xml:space="preserve"> Recruiting talent</w:t>
             </w:r>
           </w:p>
         </w:tc>
@@ -10966,15 +9877,7 @@
                 <w:sz w:val="20"/>
                 <w:szCs w:val="20"/>
               </w:rPr>
-              <w:t xml:space="preserve"> Investor</w:t>
-            </w:r>
-            <w:r>
-              <w:rPr>
-                <w:color w:val="1B1B1B"/>
-                <w:sz w:val="20"/>
-                <w:szCs w:val="20"/>
-              </w:rPr>
-              <w:t xml:space="preserve"> relations</w:t>
+              <w:t xml:space="preserve"> Investor relations</w:t>
             </w:r>
           </w:p>
         </w:tc>
@@ -11007,12 +9910,6 @@
         <w:gridCol w:w="4680"/>
       </w:tblGrid>
       <w:tr>
-        <w:tblPrEx>
-          <w:tblCellMar>
-            <w:top w:w="0" w:type="dxa"/>
-            <w:bottom w:w="0" w:type="dxa"/>
-          </w:tblCellMar>
-        </w:tblPrEx>
         <w:tc>
           <w:tcPr>
             <w:tcW w:w="4680" w:type="dxa"/>
@@ -11045,15 +9942,7 @@
                 <w:sz w:val="20"/>
                 <w:szCs w:val="20"/>
               </w:rPr>
-              <w:t xml:space="preserve"> Personal</w:t>
-            </w:r>
-            <w:r>
-              <w:rPr>
-                <w:color w:val="1B1B1B"/>
-                <w:sz w:val="20"/>
-                <w:szCs w:val="20"/>
-              </w:rPr>
-              <w:t xml:space="preserve"> branding</w:t>
+              <w:t xml:space="preserve"> Personal branding</w:t>
             </w:r>
           </w:p>
         </w:tc>
@@ -11089,15 +9978,7 @@
                 <w:sz w:val="20"/>
                 <w:szCs w:val="20"/>
               </w:rPr>
-              <w:t xml:space="preserve"> Other</w:t>
-            </w:r>
-            <w:r>
-              <w:rPr>
-                <w:color w:val="1B1B1B"/>
-                <w:sz w:val="20"/>
-                <w:szCs w:val="20"/>
-              </w:rPr>
-              <w:t>:</w:t>
+              <w:t xml:space="preserve"> Other:</w:t>
             </w:r>
           </w:p>
         </w:tc>
@@ -11144,12 +10025,6 @@
         <w:gridCol w:w="9360"/>
       </w:tblGrid>
       <w:tr>
-        <w:tblPrEx>
-          <w:tblCellMar>
-            <w:top w:w="0" w:type="dxa"/>
-            <w:bottom w:w="0" w:type="dxa"/>
-          </w:tblCellMar>
-        </w:tblPrEx>
         <w:tc>
           <w:tcPr>
             <w:tcW w:w="9360" w:type="dxa"/>
@@ -11228,12 +10103,6 @@
         <w:gridCol w:w="9360"/>
       </w:tblGrid>
       <w:tr>
-        <w:tblPrEx>
-          <w:tblCellMar>
-            <w:top w:w="0" w:type="dxa"/>
-            <w:bottom w:w="0" w:type="dxa"/>
-          </w:tblCellMar>
-        </w:tblPrEx>
         <w:tc>
           <w:tcPr>
             <w:tcW w:w="9360" w:type="dxa"/>
@@ -11296,12 +10165,6 @@
         <w:gridCol w:w="9360"/>
       </w:tblGrid>
       <w:tr>
-        <w:tblPrEx>
-          <w:tblCellMar>
-            <w:top w:w="0" w:type="dxa"/>
-            <w:bottom w:w="0" w:type="dxa"/>
-          </w:tblCellMar>
-        </w:tblPrEx>
         <w:tc>
           <w:tcPr>
             <w:tcW w:w="9360" w:type="dxa"/>
@@ -11350,12 +10213,6 @@
         <w:gridCol w:w="9160"/>
       </w:tblGrid>
       <w:tr>
-        <w:tblPrEx>
-          <w:tblCellMar>
-            <w:top w:w="0" w:type="dxa"/>
-            <w:bottom w:w="0" w:type="dxa"/>
-          </w:tblCellMar>
-        </w:tblPrEx>
         <w:tc>
           <w:tcPr>
             <w:tcW w:w="200" w:type="dxa"/>
@@ -11461,12 +10318,6 @@
         <w:gridCol w:w="9360"/>
       </w:tblGrid>
       <w:tr>
-        <w:tblPrEx>
-          <w:tblCellMar>
-            <w:top w:w="0" w:type="dxa"/>
-            <w:bottom w:w="0" w:type="dxa"/>
-          </w:tblCellMar>
-        </w:tblPrEx>
         <w:tc>
           <w:tcPr>
             <w:tcW w:w="9360" w:type="dxa"/>
@@ -11536,12 +10387,6 @@
         <w:gridCol w:w="3120"/>
       </w:tblGrid>
       <w:tr>
-        <w:tblPrEx>
-          <w:tblCellMar>
-            <w:top w:w="0" w:type="dxa"/>
-            <w:bottom w:w="0" w:type="dxa"/>
-          </w:tblCellMar>
-        </w:tblPrEx>
         <w:tc>
           <w:tcPr>
             <w:tcW w:w="3120" w:type="dxa"/>
@@ -11574,15 +10419,7 @@
                 <w:sz w:val="20"/>
                 <w:szCs w:val="20"/>
               </w:rPr>
-              <w:t xml:space="preserve"> Yes</w:t>
-            </w:r>
-            <w:r>
-              <w:rPr>
-                <w:color w:val="1B1B1B"/>
-                <w:sz w:val="20"/>
-                <w:szCs w:val="20"/>
-              </w:rPr>
-              <w:t xml:space="preserve"> — I will attach / share it</w:t>
+              <w:t xml:space="preserve"> Yes — I will attach / share it</w:t>
             </w:r>
           </w:p>
         </w:tc>
@@ -11618,15 +10455,7 @@
                 <w:sz w:val="20"/>
                 <w:szCs w:val="20"/>
               </w:rPr>
-              <w:t xml:space="preserve"> Partially</w:t>
-            </w:r>
-            <w:r>
-              <w:rPr>
-                <w:color w:val="1B1B1B"/>
-                <w:sz w:val="20"/>
-                <w:szCs w:val="20"/>
-              </w:rPr>
-              <w:t xml:space="preserve"> — I have notes</w:t>
+              <w:t xml:space="preserve"> Partially — I have notes</w:t>
             </w:r>
           </w:p>
         </w:tc>
@@ -11662,15 +10491,7 @@
                 <w:sz w:val="20"/>
                 <w:szCs w:val="20"/>
               </w:rPr>
-              <w:t xml:space="preserve"> No</w:t>
-            </w:r>
-            <w:r>
-              <w:rPr>
-                <w:color w:val="1B1B1B"/>
-                <w:sz w:val="20"/>
-                <w:szCs w:val="20"/>
-              </w:rPr>
-              <w:t xml:space="preserve"> — building from scratch</w:t>
+              <w:t xml:space="preserve"> No — building from scratch</w:t>
             </w:r>
           </w:p>
         </w:tc>
@@ -11703,12 +10524,6 @@
         <w:gridCol w:w="9160"/>
       </w:tblGrid>
       <w:tr>
-        <w:tblPrEx>
-          <w:tblCellMar>
-            <w:top w:w="0" w:type="dxa"/>
-            <w:bottom w:w="0" w:type="dxa"/>
-          </w:tblCellMar>
-        </w:tblPrEx>
         <w:tc>
           <w:tcPr>
             <w:tcW w:w="200" w:type="dxa"/>

</xml_diff>